<commit_message>
Completar documentos de la fase 1 (guia, autoevaluaciones, diario de reflexion)
</commit_message>
<xml_diff>
--- a/evidencias/fase1/individual/1.1_APT122_AutoevaluacionCompetenciasFase1.docx
+++ b/evidencias/fase1/individual/1.1_APT122_AutoevaluacionCompetenciasFase1.docx
@@ -852,14 +852,9 @@
                 <w:szCs w:val="24"/>
               </w:rPr>
             </w:pPr>
+            <w:r/>
             <w:r>
-              <w:rPr>
-                <w:rFonts w:eastAsia="" w:cs="Calibri" w:eastAsiaTheme="majorEastAsia" w:cstheme="minorAscii"/>
-                <w:color w:val="auto"/>
-                <w:sz w:val="24"/>
-                <w:szCs w:val="24"/>
-              </w:rPr>
-              <w:t>Escuela</w:t>
+              <w:t>Escuela de Informática y Telecomunicaciones</w:t>
             </w:r>
           </w:p>
         </w:tc>
@@ -920,6 +915,10 @@
                 <w:szCs w:val="24"/>
               </w:rPr>
             </w:pPr>
+            <w:r/>
+            <w:r>
+              <w:t>Jonatan Roa</w:t>
+            </w:r>
           </w:p>
         </w:tc>
       </w:tr>
@@ -976,6 +975,10 @@
                 <w:szCs w:val="24"/>
               </w:rPr>
             </w:pPr>
+            <w:r/>
+            <w:r>
+              <w:t>Plan de Estudios Ingeniería en Informática</w:t>
+            </w:r>
           </w:p>
         </w:tc>
       </w:tr>
@@ -1035,6 +1038,10 @@
                 <w:szCs w:val="24"/>
               </w:rPr>
             </w:pPr>
+            <w:r/>
+            <w:r>
+              <w:t>2023</w:t>
+            </w:r>
           </w:p>
         </w:tc>
       </w:tr>
@@ -1411,6 +1418,10 @@
                 <w:szCs w:val="18"/>
               </w:rPr>
             </w:pPr>
+            <w:r/>
+            <w:r>
+              <w:t>Realizar pruebas de certificación tanto de los productos como de los procesos utilizando buenas prácticas definidas por la industria.</w:t>
+            </w:r>
           </w:p>
         </w:tc>
         <w:tc>
@@ -1429,6 +1440,439 @@
                 <w:szCs w:val="18"/>
               </w:rPr>
             </w:pPr>
+          </w:p>
+        </w:tc>
+        <w:tc>
+          <w:tcPr>
+            <w:tcW w:w="926" w:type="dxa"/>
+            <w:tcMar/>
+          </w:tcPr>
+          <w:p w14:noSpellErr="1">
+            <w:pPr>
+              <w:jc w:val="center"/>
+              <w:rPr>
+                <w:rFonts w:cs="Calibri" w:cstheme="minorAscii"/>
+                <w:b w:val="1"/>
+                <w:bCs w:val="1"/>
+                <w:sz w:val="18"/>
+                <w:szCs w:val="18"/>
+              </w:rPr>
+            </w:pPr>
+          </w:p>
+        </w:tc>
+        <w:tc>
+          <w:tcPr>
+            <w:tcW w:w="1055" w:type="dxa"/>
+            <w:tcMar/>
+          </w:tcPr>
+          <w:p w14:noSpellErr="1">
+            <w:pPr>
+              <w:jc w:val="center"/>
+              <w:rPr>
+                <w:rFonts w:cs="Calibri" w:cstheme="minorAscii"/>
+                <w:b w:val="1"/>
+                <w:bCs w:val="1"/>
+                <w:sz w:val="18"/>
+                <w:szCs w:val="18"/>
+              </w:rPr>
+            </w:pPr>
+            <w:r>
+              <w:t>X</w:t>
+            </w:r>
+          </w:p>
+        </w:tc>
+        <w:tc>
+          <w:tcPr>
+            <w:tcW w:w="1187" w:type="dxa"/>
+            <w:tcMar/>
+          </w:tcPr>
+          <w:p w14:noSpellErr="1">
+            <w:pPr>
+              <w:jc w:val="center"/>
+              <w:rPr>
+                <w:rFonts w:cs="Calibri" w:cstheme="minorAscii"/>
+                <w:b w:val="1"/>
+                <w:bCs w:val="1"/>
+                <w:sz w:val="18"/>
+                <w:szCs w:val="18"/>
+              </w:rPr>
+            </w:pPr>
+          </w:p>
+        </w:tc>
+        <w:tc>
+          <w:tcPr>
+            <w:tcW w:w="1250" w:type="dxa"/>
+            <w:tcMar/>
+          </w:tcPr>
+          <w:p w14:noSpellErr="1">
+            <w:pPr>
+              <w:jc w:val="center"/>
+              <w:rPr>
+                <w:rFonts w:cs="Calibri" w:cstheme="minorAscii"/>
+                <w:b w:val="1"/>
+                <w:bCs w:val="1"/>
+                <w:sz w:val="18"/>
+                <w:szCs w:val="18"/>
+              </w:rPr>
+            </w:pPr>
+          </w:p>
+        </w:tc>
+        <w:tc>
+          <w:tcPr>
+            <w:tcW w:w="2557" w:type="dxa"/>
+            <w:tcMar/>
+          </w:tcPr>
+          <w:p w14:noSpellErr="1">
+            <w:pPr>
+              <w:jc w:val="center"/>
+              <w:rPr>
+                <w:rFonts w:cs="Calibri" w:cstheme="minorAscii"/>
+                <w:b w:val="1"/>
+                <w:bCs w:val="1"/>
+                <w:sz w:val="18"/>
+                <w:szCs w:val="18"/>
+              </w:rPr>
+            </w:pPr>
+            <w:r/>
+            <w:r>
+              <w:t>Tengo un dominio básico de diseño y aplicación de pruebas; curso de certificación y trabajos prácticos me permiten lograr los aspectos centrales, pero debo reforzar pruebas automatizadas y de integración.</w:t>
+            </w:r>
+          </w:p>
+        </w:tc>
+      </w:tr>
+      <w:tr>
+        <w:trPr>
+          <w:trHeight w:val="576"/>
+          <w:jc w:val="center"/>
+        </w:trPr>
+        <w:tc>
+          <w:tcPr>
+            <w:tcW w:w="1931" w:type="dxa"/>
+            <w:tcMar/>
+          </w:tcPr>
+          <w:p w14:noSpellErr="1">
+            <w:pPr>
+              <w:jc w:val="center"/>
+              <w:rPr>
+                <w:rFonts w:cs="Calibri" w:cstheme="minorAscii"/>
+                <w:b w:val="1"/>
+                <w:bCs w:val="1"/>
+                <w:color w:val="FF0000"/>
+                <w:sz w:val="18"/>
+                <w:szCs w:val="18"/>
+              </w:rPr>
+            </w:pPr>
+            <w:r/>
+            <w:r>
+              <w:t>Gestionar proyectos informáticos, ofreciendo alternativas para la toma de decisiones de acuerdo a los requerimientos de la organización.</w:t>
+            </w:r>
+          </w:p>
+        </w:tc>
+        <w:tc>
+          <w:tcPr>
+            <w:tcW w:w="1017" w:type="dxa"/>
+            <w:tcMar/>
+          </w:tcPr>
+          <w:p w14:noSpellErr="1">
+            <w:pPr>
+              <w:jc w:val="center"/>
+              <w:rPr>
+                <w:rFonts w:cs="Calibri" w:cstheme="minorAscii"/>
+                <w:b w:val="1"/>
+                <w:bCs w:val="1"/>
+                <w:sz w:val="18"/>
+                <w:szCs w:val="18"/>
+              </w:rPr>
+            </w:pPr>
+          </w:p>
+        </w:tc>
+        <w:tc>
+          <w:tcPr>
+            <w:tcW w:w="926" w:type="dxa"/>
+            <w:tcMar/>
+          </w:tcPr>
+          <w:p w14:noSpellErr="1">
+            <w:pPr>
+              <w:jc w:val="center"/>
+              <w:rPr>
+                <w:rFonts w:cs="Calibri" w:cstheme="minorAscii"/>
+                <w:b w:val="1"/>
+                <w:bCs w:val="1"/>
+                <w:sz w:val="18"/>
+                <w:szCs w:val="18"/>
+              </w:rPr>
+            </w:pPr>
+            <w:r>
+              <w:t>X</w:t>
+            </w:r>
+          </w:p>
+        </w:tc>
+        <w:tc>
+          <w:tcPr>
+            <w:tcW w:w="1055" w:type="dxa"/>
+            <w:tcMar/>
+          </w:tcPr>
+          <w:p w14:noSpellErr="1">
+            <w:pPr>
+              <w:jc w:val="center"/>
+              <w:rPr>
+                <w:rFonts w:cs="Calibri" w:cstheme="minorAscii"/>
+                <w:b w:val="1"/>
+                <w:bCs w:val="1"/>
+                <w:sz w:val="18"/>
+                <w:szCs w:val="18"/>
+              </w:rPr>
+            </w:pPr>
+          </w:p>
+        </w:tc>
+        <w:tc>
+          <w:tcPr>
+            <w:tcW w:w="1187" w:type="dxa"/>
+            <w:tcMar/>
+          </w:tcPr>
+          <w:p w14:noSpellErr="1">
+            <w:pPr>
+              <w:jc w:val="center"/>
+              <w:rPr>
+                <w:rFonts w:cs="Calibri" w:cstheme="minorAscii"/>
+                <w:b w:val="1"/>
+                <w:bCs w:val="1"/>
+                <w:sz w:val="18"/>
+                <w:szCs w:val="18"/>
+              </w:rPr>
+            </w:pPr>
+          </w:p>
+        </w:tc>
+        <w:tc>
+          <w:tcPr>
+            <w:tcW w:w="1250" w:type="dxa"/>
+            <w:tcMar/>
+          </w:tcPr>
+          <w:p w14:noSpellErr="1">
+            <w:pPr>
+              <w:jc w:val="center"/>
+              <w:rPr>
+                <w:rFonts w:cs="Calibri" w:cstheme="minorAscii"/>
+                <w:b w:val="1"/>
+                <w:bCs w:val="1"/>
+                <w:sz w:val="18"/>
+                <w:szCs w:val="18"/>
+              </w:rPr>
+            </w:pPr>
+          </w:p>
+        </w:tc>
+        <w:tc>
+          <w:tcPr>
+            <w:tcW w:w="2557" w:type="dxa"/>
+            <w:tcMar/>
+          </w:tcPr>
+          <w:p w14:noSpellErr="1">
+            <w:pPr>
+              <w:jc w:val="center"/>
+              <w:rPr>
+                <w:rFonts w:cs="Calibri" w:cstheme="minorAscii"/>
+                <w:b w:val="1"/>
+                <w:bCs w:val="1"/>
+                <w:sz w:val="18"/>
+                <w:szCs w:val="18"/>
+              </w:rPr>
+            </w:pPr>
+            <w:r/>
+            <w:r>
+              <w:t>Muy buen dominio: he liderado proyectos académicos aplicando Scrum y planificación de tareas; debo reforzar la gestión de riesgos y estimaciones de esfuerzo.</w:t>
+            </w:r>
+          </w:p>
+        </w:tc>
+      </w:tr>
+      <w:tr>
+        <w:trPr>
+          <w:trHeight w:val="591"/>
+          <w:jc w:val="center"/>
+        </w:trPr>
+        <w:tc>
+          <w:tcPr>
+            <w:tcW w:w="1931" w:type="dxa"/>
+            <w:tcMar/>
+          </w:tcPr>
+          <w:p w14:noSpellErr="1">
+            <w:pPr>
+              <w:jc w:val="center"/>
+              <w:rPr>
+                <w:rFonts w:cs="Calibri" w:cstheme="minorAscii"/>
+                <w:b w:val="1"/>
+                <w:bCs w:val="1"/>
+                <w:sz w:val="18"/>
+                <w:szCs w:val="18"/>
+              </w:rPr>
+            </w:pPr>
+            <w:r/>
+            <w:r>
+              <w:t>Construir modelos de datos para soportar los requerimientos de la organización de acuerdo a un diseño definido y escalable en el tiempo.</w:t>
+            </w:r>
+          </w:p>
+        </w:tc>
+        <w:tc>
+          <w:tcPr>
+            <w:tcW w:w="1017" w:type="dxa"/>
+            <w:tcMar/>
+          </w:tcPr>
+          <w:p w14:noSpellErr="1">
+            <w:pPr>
+              <w:jc w:val="center"/>
+              <w:rPr>
+                <w:rFonts w:cs="Calibri" w:cstheme="minorAscii"/>
+                <w:b w:val="1"/>
+                <w:bCs w:val="1"/>
+                <w:sz w:val="18"/>
+                <w:szCs w:val="18"/>
+              </w:rPr>
+            </w:pPr>
+          </w:p>
+        </w:tc>
+        <w:tc>
+          <w:tcPr>
+            <w:tcW w:w="926" w:type="dxa"/>
+            <w:tcMar/>
+          </w:tcPr>
+          <w:p w14:noSpellErr="1">
+            <w:pPr>
+              <w:jc w:val="center"/>
+              <w:rPr>
+                <w:rFonts w:cs="Calibri" w:cstheme="minorAscii"/>
+                <w:b w:val="1"/>
+                <w:bCs w:val="1"/>
+                <w:sz w:val="18"/>
+                <w:szCs w:val="18"/>
+              </w:rPr>
+            </w:pPr>
+            <w:r>
+              <w:t>X</w:t>
+            </w:r>
+          </w:p>
+        </w:tc>
+        <w:tc>
+          <w:tcPr>
+            <w:tcW w:w="1055" w:type="dxa"/>
+            <w:tcMar/>
+          </w:tcPr>
+          <w:p w14:noSpellErr="1">
+            <w:pPr>
+              <w:jc w:val="center"/>
+              <w:rPr>
+                <w:rFonts w:cs="Calibri" w:cstheme="minorAscii"/>
+                <w:b w:val="1"/>
+                <w:bCs w:val="1"/>
+                <w:sz w:val="18"/>
+                <w:szCs w:val="18"/>
+              </w:rPr>
+            </w:pPr>
+          </w:p>
+        </w:tc>
+        <w:tc>
+          <w:tcPr>
+            <w:tcW w:w="1187" w:type="dxa"/>
+            <w:tcMar/>
+          </w:tcPr>
+          <w:p w14:noSpellErr="1">
+            <w:pPr>
+              <w:jc w:val="center"/>
+              <w:rPr>
+                <w:rFonts w:cs="Calibri" w:cstheme="minorAscii"/>
+                <w:b w:val="1"/>
+                <w:bCs w:val="1"/>
+                <w:sz w:val="18"/>
+                <w:szCs w:val="18"/>
+              </w:rPr>
+            </w:pPr>
+          </w:p>
+        </w:tc>
+        <w:tc>
+          <w:tcPr>
+            <w:tcW w:w="1250" w:type="dxa"/>
+            <w:tcMar/>
+          </w:tcPr>
+          <w:p w14:noSpellErr="1">
+            <w:pPr>
+              <w:jc w:val="center"/>
+              <w:rPr>
+                <w:rFonts w:cs="Calibri" w:cstheme="minorAscii"/>
+                <w:b w:val="1"/>
+                <w:bCs w:val="1"/>
+                <w:sz w:val="18"/>
+                <w:szCs w:val="18"/>
+              </w:rPr>
+            </w:pPr>
+          </w:p>
+        </w:tc>
+        <w:tc>
+          <w:tcPr>
+            <w:tcW w:w="2557" w:type="dxa"/>
+            <w:tcMar/>
+          </w:tcPr>
+          <w:p w14:noSpellErr="1">
+            <w:pPr>
+              <w:jc w:val="center"/>
+              <w:rPr>
+                <w:rFonts w:cs="Calibri" w:cstheme="minorAscii"/>
+                <w:b w:val="1"/>
+                <w:bCs w:val="1"/>
+                <w:sz w:val="18"/>
+                <w:szCs w:val="18"/>
+              </w:rPr>
+            </w:pPr>
+            <w:r/>
+            <w:r>
+              <w:t>Me siento seguro modelando bases de datos relacionales y diseñando esquemas normalizados y escalables; debo profundizar en modelado NoSQL y rendimiento.</w:t>
+            </w:r>
+          </w:p>
+        </w:tc>
+      </w:tr>
+      <w:tr>
+        <w:trPr>
+          <w:trHeight w:val="591"/>
+          <w:jc w:val="center"/>
+        </w:trPr>
+        <w:tc>
+          <w:tcPr>
+            <w:tcW w:w="1931" w:type="dxa"/>
+            <w:tcMar/>
+          </w:tcPr>
+          <w:p w14:noSpellErr="1">
+            <w:pPr>
+              <w:jc w:val="center"/>
+              <w:rPr>
+                <w:rFonts w:cs="Calibri" w:cstheme="minorAscii"/>
+                <w:b w:val="1"/>
+                <w:bCs w:val="1"/>
+                <w:sz w:val="18"/>
+                <w:szCs w:val="18"/>
+              </w:rPr>
+            </w:pPr>
+            <w:r/>
+            <w:r>
+              <w:t>Desarrollar una solución de software utilizando técnicas que permitan sistematizar el proceso de desarrollo y mantenimiento, asegurando el logro de los objetivos.</w:t>
+            </w:r>
+          </w:p>
+        </w:tc>
+        <w:tc>
+          <w:tcPr>
+            <w:tcW w:w="1017" w:type="dxa"/>
+            <w:tcMar/>
+          </w:tcPr>
+          <w:p w14:noSpellErr="1">
+            <w:pPr>
+              <w:jc w:val="center"/>
+              <w:rPr>
+                <w:rFonts w:cs="Calibri" w:cstheme="minorAscii"/>
+                <w:b w:val="1"/>
+                <w:bCs w:val="1"/>
+                <w:sz w:val="18"/>
+                <w:szCs w:val="18"/>
+              </w:rPr>
+            </w:pPr>
+            <w:r>
+              <w:t>X</w:t>
+            </w:r>
           </w:p>
         </w:tc>
         <w:tc>
@@ -1519,931 +1963,10 @@
                 <w:szCs w:val="18"/>
               </w:rPr>
             </w:pPr>
-          </w:p>
-        </w:tc>
-      </w:tr>
-      <w:tr>
-        <w:trPr>
-          <w:trHeight w:val="576"/>
-          <w:jc w:val="center"/>
-        </w:trPr>
-        <w:tc>
-          <w:tcPr>
-            <w:tcW w:w="1931" w:type="dxa"/>
-            <w:tcMar/>
-          </w:tcPr>
-          <w:p w14:noSpellErr="1">
-            <w:pPr>
-              <w:jc w:val="center"/>
-              <w:rPr>
-                <w:rFonts w:cs="Calibri" w:cstheme="minorAscii"/>
-                <w:b w:val="1"/>
-                <w:bCs w:val="1"/>
-                <w:color w:val="FF0000"/>
-                <w:sz w:val="18"/>
-                <w:szCs w:val="18"/>
-              </w:rPr>
-            </w:pPr>
-          </w:p>
-        </w:tc>
-        <w:tc>
-          <w:tcPr>
-            <w:tcW w:w="1017" w:type="dxa"/>
-            <w:tcMar/>
-          </w:tcPr>
-          <w:p w14:noSpellErr="1">
-            <w:pPr>
-              <w:jc w:val="center"/>
-              <w:rPr>
-                <w:rFonts w:cs="Calibri" w:cstheme="minorAscii"/>
-                <w:b w:val="1"/>
-                <w:bCs w:val="1"/>
-                <w:sz w:val="18"/>
-                <w:szCs w:val="18"/>
-              </w:rPr>
-            </w:pPr>
-          </w:p>
-        </w:tc>
-        <w:tc>
-          <w:tcPr>
-            <w:tcW w:w="926" w:type="dxa"/>
-            <w:tcMar/>
-          </w:tcPr>
-          <w:p w14:noSpellErr="1">
-            <w:pPr>
-              <w:jc w:val="center"/>
-              <w:rPr>
-                <w:rFonts w:cs="Calibri" w:cstheme="minorAscii"/>
-                <w:b w:val="1"/>
-                <w:bCs w:val="1"/>
-                <w:sz w:val="18"/>
-                <w:szCs w:val="18"/>
-              </w:rPr>
-            </w:pPr>
-          </w:p>
-        </w:tc>
-        <w:tc>
-          <w:tcPr>
-            <w:tcW w:w="1055" w:type="dxa"/>
-            <w:tcMar/>
-          </w:tcPr>
-          <w:p w14:noSpellErr="1">
-            <w:pPr>
-              <w:jc w:val="center"/>
-              <w:rPr>
-                <w:rFonts w:cs="Calibri" w:cstheme="minorAscii"/>
-                <w:b w:val="1"/>
-                <w:bCs w:val="1"/>
-                <w:sz w:val="18"/>
-                <w:szCs w:val="18"/>
-              </w:rPr>
-            </w:pPr>
-          </w:p>
-        </w:tc>
-        <w:tc>
-          <w:tcPr>
-            <w:tcW w:w="1187" w:type="dxa"/>
-            <w:tcMar/>
-          </w:tcPr>
-          <w:p w14:noSpellErr="1">
-            <w:pPr>
-              <w:jc w:val="center"/>
-              <w:rPr>
-                <w:rFonts w:cs="Calibri" w:cstheme="minorAscii"/>
-                <w:b w:val="1"/>
-                <w:bCs w:val="1"/>
-                <w:sz w:val="18"/>
-                <w:szCs w:val="18"/>
-              </w:rPr>
-            </w:pPr>
-          </w:p>
-        </w:tc>
-        <w:tc>
-          <w:tcPr>
-            <w:tcW w:w="1250" w:type="dxa"/>
-            <w:tcMar/>
-          </w:tcPr>
-          <w:p w14:noSpellErr="1">
-            <w:pPr>
-              <w:jc w:val="center"/>
-              <w:rPr>
-                <w:rFonts w:cs="Calibri" w:cstheme="minorAscii"/>
-                <w:b w:val="1"/>
-                <w:bCs w:val="1"/>
-                <w:sz w:val="18"/>
-                <w:szCs w:val="18"/>
-              </w:rPr>
-            </w:pPr>
-          </w:p>
-        </w:tc>
-        <w:tc>
-          <w:tcPr>
-            <w:tcW w:w="2557" w:type="dxa"/>
-            <w:tcMar/>
-          </w:tcPr>
-          <w:p w14:noSpellErr="1">
-            <w:pPr>
-              <w:jc w:val="center"/>
-              <w:rPr>
-                <w:rFonts w:cs="Calibri" w:cstheme="minorAscii"/>
-                <w:b w:val="1"/>
-                <w:bCs w:val="1"/>
-                <w:sz w:val="18"/>
-                <w:szCs w:val="18"/>
-              </w:rPr>
-            </w:pPr>
-          </w:p>
-        </w:tc>
-      </w:tr>
-      <w:tr>
-        <w:trPr>
-          <w:trHeight w:val="591"/>
-          <w:jc w:val="center"/>
-        </w:trPr>
-        <w:tc>
-          <w:tcPr>
-            <w:tcW w:w="1931" w:type="dxa"/>
-            <w:tcMar/>
-          </w:tcPr>
-          <w:p w14:noSpellErr="1">
-            <w:pPr>
-              <w:jc w:val="center"/>
-              <w:rPr>
-                <w:rFonts w:cs="Calibri" w:cstheme="minorAscii"/>
-                <w:b w:val="1"/>
-                <w:bCs w:val="1"/>
-                <w:sz w:val="18"/>
-                <w:szCs w:val="18"/>
-              </w:rPr>
-            </w:pPr>
-          </w:p>
-        </w:tc>
-        <w:tc>
-          <w:tcPr>
-            <w:tcW w:w="1017" w:type="dxa"/>
-            <w:tcMar/>
-          </w:tcPr>
-          <w:p w14:noSpellErr="1">
-            <w:pPr>
-              <w:jc w:val="center"/>
-              <w:rPr>
-                <w:rFonts w:cs="Calibri" w:cstheme="minorAscii"/>
-                <w:b w:val="1"/>
-                <w:bCs w:val="1"/>
-                <w:sz w:val="18"/>
-                <w:szCs w:val="18"/>
-              </w:rPr>
-            </w:pPr>
-          </w:p>
-        </w:tc>
-        <w:tc>
-          <w:tcPr>
-            <w:tcW w:w="926" w:type="dxa"/>
-            <w:tcMar/>
-          </w:tcPr>
-          <w:p w14:noSpellErr="1">
-            <w:pPr>
-              <w:jc w:val="center"/>
-              <w:rPr>
-                <w:rFonts w:cs="Calibri" w:cstheme="minorAscii"/>
-                <w:b w:val="1"/>
-                <w:bCs w:val="1"/>
-                <w:sz w:val="18"/>
-                <w:szCs w:val="18"/>
-              </w:rPr>
-            </w:pPr>
-          </w:p>
-        </w:tc>
-        <w:tc>
-          <w:tcPr>
-            <w:tcW w:w="1055" w:type="dxa"/>
-            <w:tcMar/>
-          </w:tcPr>
-          <w:p w14:noSpellErr="1">
-            <w:pPr>
-              <w:jc w:val="center"/>
-              <w:rPr>
-                <w:rFonts w:cs="Calibri" w:cstheme="minorAscii"/>
-                <w:b w:val="1"/>
-                <w:bCs w:val="1"/>
-                <w:sz w:val="18"/>
-                <w:szCs w:val="18"/>
-              </w:rPr>
-            </w:pPr>
-          </w:p>
-        </w:tc>
-        <w:tc>
-          <w:tcPr>
-            <w:tcW w:w="1187" w:type="dxa"/>
-            <w:tcMar/>
-          </w:tcPr>
-          <w:p w14:noSpellErr="1">
-            <w:pPr>
-              <w:jc w:val="center"/>
-              <w:rPr>
-                <w:rFonts w:cs="Calibri" w:cstheme="minorAscii"/>
-                <w:b w:val="1"/>
-                <w:bCs w:val="1"/>
-                <w:sz w:val="18"/>
-                <w:szCs w:val="18"/>
-              </w:rPr>
-            </w:pPr>
-          </w:p>
-        </w:tc>
-        <w:tc>
-          <w:tcPr>
-            <w:tcW w:w="1250" w:type="dxa"/>
-            <w:tcMar/>
-          </w:tcPr>
-          <w:p w14:noSpellErr="1">
-            <w:pPr>
-              <w:jc w:val="center"/>
-              <w:rPr>
-                <w:rFonts w:cs="Calibri" w:cstheme="minorAscii"/>
-                <w:b w:val="1"/>
-                <w:bCs w:val="1"/>
-                <w:sz w:val="18"/>
-                <w:szCs w:val="18"/>
-              </w:rPr>
-            </w:pPr>
-          </w:p>
-        </w:tc>
-        <w:tc>
-          <w:tcPr>
-            <w:tcW w:w="2557" w:type="dxa"/>
-            <w:tcMar/>
-          </w:tcPr>
-          <w:p w14:noSpellErr="1">
-            <w:pPr>
-              <w:jc w:val="center"/>
-              <w:rPr>
-                <w:rFonts w:cs="Calibri" w:cstheme="minorAscii"/>
-                <w:b w:val="1"/>
-                <w:bCs w:val="1"/>
-                <w:sz w:val="18"/>
-                <w:szCs w:val="18"/>
-              </w:rPr>
-            </w:pPr>
-          </w:p>
-        </w:tc>
-      </w:tr>
-      <w:tr>
-        <w:trPr>
-          <w:trHeight w:val="591"/>
-          <w:jc w:val="center"/>
-        </w:trPr>
-        <w:tc>
-          <w:tcPr>
-            <w:tcW w:w="1931" w:type="dxa"/>
-            <w:tcMar/>
-          </w:tcPr>
-          <w:p w14:noSpellErr="1">
-            <w:pPr>
-              <w:jc w:val="center"/>
-              <w:rPr>
-                <w:rFonts w:cs="Calibri" w:cstheme="minorAscii"/>
-                <w:b w:val="1"/>
-                <w:bCs w:val="1"/>
-                <w:sz w:val="18"/>
-                <w:szCs w:val="18"/>
-              </w:rPr>
-            </w:pPr>
-          </w:p>
-        </w:tc>
-        <w:tc>
-          <w:tcPr>
-            <w:tcW w:w="1017" w:type="dxa"/>
-            <w:tcMar/>
-          </w:tcPr>
-          <w:p w14:noSpellErr="1">
-            <w:pPr>
-              <w:jc w:val="center"/>
-              <w:rPr>
-                <w:rFonts w:cs="Calibri" w:cstheme="minorAscii"/>
-                <w:b w:val="1"/>
-                <w:bCs w:val="1"/>
-                <w:sz w:val="18"/>
-                <w:szCs w:val="18"/>
-              </w:rPr>
-            </w:pPr>
-          </w:p>
-        </w:tc>
-        <w:tc>
-          <w:tcPr>
-            <w:tcW w:w="926" w:type="dxa"/>
-            <w:tcMar/>
-          </w:tcPr>
-          <w:p w14:noSpellErr="1">
-            <w:pPr>
-              <w:jc w:val="center"/>
-              <w:rPr>
-                <w:rFonts w:cs="Calibri" w:cstheme="minorAscii"/>
-                <w:b w:val="1"/>
-                <w:bCs w:val="1"/>
-                <w:sz w:val="18"/>
-                <w:szCs w:val="18"/>
-              </w:rPr>
-            </w:pPr>
-          </w:p>
-        </w:tc>
-        <w:tc>
-          <w:tcPr>
-            <w:tcW w:w="1055" w:type="dxa"/>
-            <w:tcMar/>
-          </w:tcPr>
-          <w:p w14:noSpellErr="1">
-            <w:pPr>
-              <w:jc w:val="center"/>
-              <w:rPr>
-                <w:rFonts w:cs="Calibri" w:cstheme="minorAscii"/>
-                <w:b w:val="1"/>
-                <w:bCs w:val="1"/>
-                <w:sz w:val="18"/>
-                <w:szCs w:val="18"/>
-              </w:rPr>
-            </w:pPr>
-          </w:p>
-        </w:tc>
-        <w:tc>
-          <w:tcPr>
-            <w:tcW w:w="1187" w:type="dxa"/>
-            <w:tcMar/>
-          </w:tcPr>
-          <w:p w14:noSpellErr="1">
-            <w:pPr>
-              <w:jc w:val="center"/>
-              <w:rPr>
-                <w:rFonts w:cs="Calibri" w:cstheme="minorAscii"/>
-                <w:b w:val="1"/>
-                <w:bCs w:val="1"/>
-                <w:sz w:val="18"/>
-                <w:szCs w:val="18"/>
-              </w:rPr>
-            </w:pPr>
-          </w:p>
-        </w:tc>
-        <w:tc>
-          <w:tcPr>
-            <w:tcW w:w="1250" w:type="dxa"/>
-            <w:tcMar/>
-          </w:tcPr>
-          <w:p w14:noSpellErr="1">
-            <w:pPr>
-              <w:jc w:val="center"/>
-              <w:rPr>
-                <w:rFonts w:cs="Calibri" w:cstheme="minorAscii"/>
-                <w:b w:val="1"/>
-                <w:bCs w:val="1"/>
-                <w:sz w:val="18"/>
-                <w:szCs w:val="18"/>
-              </w:rPr>
-            </w:pPr>
-          </w:p>
-        </w:tc>
-        <w:tc>
-          <w:tcPr>
-            <w:tcW w:w="2557" w:type="dxa"/>
-            <w:tcMar/>
-          </w:tcPr>
-          <w:p w14:noSpellErr="1">
-            <w:pPr>
-              <w:jc w:val="center"/>
-              <w:rPr>
-                <w:rFonts w:cs="Calibri" w:cstheme="minorAscii"/>
-                <w:b w:val="1"/>
-                <w:bCs w:val="1"/>
-                <w:sz w:val="18"/>
-                <w:szCs w:val="18"/>
-              </w:rPr>
-            </w:pPr>
-          </w:p>
-        </w:tc>
-      </w:tr>
-      <w:tr>
-        <w:trPr>
-          <w:trHeight w:val="591"/>
-          <w:jc w:val="center"/>
-        </w:trPr>
-        <w:tc>
-          <w:tcPr>
-            <w:tcW w:w="1931" w:type="dxa"/>
-            <w:tcMar/>
-          </w:tcPr>
-          <w:p w14:noSpellErr="1">
-            <w:pPr>
-              <w:jc w:val="center"/>
-              <w:rPr>
-                <w:rFonts w:cs="Calibri" w:cstheme="minorAscii"/>
-                <w:b w:val="1"/>
-                <w:bCs w:val="1"/>
-                <w:sz w:val="18"/>
-                <w:szCs w:val="18"/>
-              </w:rPr>
-            </w:pPr>
-          </w:p>
-        </w:tc>
-        <w:tc>
-          <w:tcPr>
-            <w:tcW w:w="1017" w:type="dxa"/>
-            <w:tcMar/>
-          </w:tcPr>
-          <w:p w14:noSpellErr="1">
-            <w:pPr>
-              <w:jc w:val="center"/>
-              <w:rPr>
-                <w:rFonts w:cs="Calibri" w:cstheme="minorAscii"/>
-                <w:b w:val="1"/>
-                <w:bCs w:val="1"/>
-                <w:sz w:val="18"/>
-                <w:szCs w:val="18"/>
-              </w:rPr>
-            </w:pPr>
-          </w:p>
-        </w:tc>
-        <w:tc>
-          <w:tcPr>
-            <w:tcW w:w="926" w:type="dxa"/>
-            <w:tcMar/>
-          </w:tcPr>
-          <w:p w14:noSpellErr="1">
-            <w:pPr>
-              <w:jc w:val="center"/>
-              <w:rPr>
-                <w:rFonts w:cs="Calibri" w:cstheme="minorAscii"/>
-                <w:b w:val="1"/>
-                <w:bCs w:val="1"/>
-                <w:sz w:val="18"/>
-                <w:szCs w:val="18"/>
-              </w:rPr>
-            </w:pPr>
-          </w:p>
-        </w:tc>
-        <w:tc>
-          <w:tcPr>
-            <w:tcW w:w="1055" w:type="dxa"/>
-            <w:tcMar/>
-          </w:tcPr>
-          <w:p w14:noSpellErr="1">
-            <w:pPr>
-              <w:jc w:val="center"/>
-              <w:rPr>
-                <w:rFonts w:cs="Calibri" w:cstheme="minorAscii"/>
-                <w:b w:val="1"/>
-                <w:bCs w:val="1"/>
-                <w:sz w:val="18"/>
-                <w:szCs w:val="18"/>
-              </w:rPr>
-            </w:pPr>
-          </w:p>
-        </w:tc>
-        <w:tc>
-          <w:tcPr>
-            <w:tcW w:w="1187" w:type="dxa"/>
-            <w:tcMar/>
-          </w:tcPr>
-          <w:p w14:noSpellErr="1">
-            <w:pPr>
-              <w:jc w:val="center"/>
-              <w:rPr>
-                <w:rFonts w:cs="Calibri" w:cstheme="minorAscii"/>
-                <w:b w:val="1"/>
-                <w:bCs w:val="1"/>
-                <w:sz w:val="18"/>
-                <w:szCs w:val="18"/>
-              </w:rPr>
-            </w:pPr>
-          </w:p>
-        </w:tc>
-        <w:tc>
-          <w:tcPr>
-            <w:tcW w:w="1250" w:type="dxa"/>
-            <w:tcMar/>
-          </w:tcPr>
-          <w:p w14:noSpellErr="1">
-            <w:pPr>
-              <w:jc w:val="center"/>
-              <w:rPr>
-                <w:rFonts w:cs="Calibri" w:cstheme="minorAscii"/>
-                <w:b w:val="1"/>
-                <w:bCs w:val="1"/>
-                <w:sz w:val="18"/>
-                <w:szCs w:val="18"/>
-              </w:rPr>
-            </w:pPr>
-          </w:p>
-        </w:tc>
-        <w:tc>
-          <w:tcPr>
-            <w:tcW w:w="2557" w:type="dxa"/>
-            <w:tcMar/>
-          </w:tcPr>
-          <w:p w14:noSpellErr="1">
-            <w:pPr>
-              <w:jc w:val="center"/>
-              <w:rPr>
-                <w:rFonts w:cs="Calibri" w:cstheme="minorAscii"/>
-                <w:b w:val="1"/>
-                <w:bCs w:val="1"/>
-                <w:sz w:val="18"/>
-                <w:szCs w:val="18"/>
-              </w:rPr>
-            </w:pPr>
-          </w:p>
-        </w:tc>
-      </w:tr>
-      <w:tr>
-        <w:trPr>
-          <w:trHeight w:val="576"/>
-          <w:jc w:val="center"/>
-        </w:trPr>
-        <w:tc>
-          <w:tcPr>
-            <w:tcW w:w="1931" w:type="dxa"/>
-            <w:tcMar/>
-          </w:tcPr>
-          <w:p w14:noSpellErr="1">
-            <w:pPr>
-              <w:jc w:val="center"/>
-              <w:rPr>
-                <w:rFonts w:cs="Calibri" w:cstheme="minorAscii"/>
-                <w:b w:val="1"/>
-                <w:bCs w:val="1"/>
-                <w:sz w:val="18"/>
-                <w:szCs w:val="18"/>
-              </w:rPr>
-            </w:pPr>
-          </w:p>
-        </w:tc>
-        <w:tc>
-          <w:tcPr>
-            <w:tcW w:w="1017" w:type="dxa"/>
-            <w:tcMar/>
-          </w:tcPr>
-          <w:p w14:noSpellErr="1">
-            <w:pPr>
-              <w:jc w:val="center"/>
-              <w:rPr>
-                <w:rFonts w:cs="Calibri" w:cstheme="minorAscii"/>
-                <w:b w:val="1"/>
-                <w:bCs w:val="1"/>
-                <w:sz w:val="18"/>
-                <w:szCs w:val="18"/>
-              </w:rPr>
-            </w:pPr>
-          </w:p>
-        </w:tc>
-        <w:tc>
-          <w:tcPr>
-            <w:tcW w:w="926" w:type="dxa"/>
-            <w:tcMar/>
-          </w:tcPr>
-          <w:p w14:noSpellErr="1">
-            <w:pPr>
-              <w:jc w:val="center"/>
-              <w:rPr>
-                <w:rFonts w:cs="Calibri" w:cstheme="minorAscii"/>
-                <w:b w:val="1"/>
-                <w:bCs w:val="1"/>
-                <w:sz w:val="18"/>
-                <w:szCs w:val="18"/>
-              </w:rPr>
-            </w:pPr>
-          </w:p>
-        </w:tc>
-        <w:tc>
-          <w:tcPr>
-            <w:tcW w:w="1055" w:type="dxa"/>
-            <w:tcMar/>
-          </w:tcPr>
-          <w:p w14:noSpellErr="1">
-            <w:pPr>
-              <w:jc w:val="center"/>
-              <w:rPr>
-                <w:rFonts w:cs="Calibri" w:cstheme="minorAscii"/>
-                <w:b w:val="1"/>
-                <w:bCs w:val="1"/>
-                <w:sz w:val="18"/>
-                <w:szCs w:val="18"/>
-              </w:rPr>
-            </w:pPr>
-          </w:p>
-        </w:tc>
-        <w:tc>
-          <w:tcPr>
-            <w:tcW w:w="1187" w:type="dxa"/>
-            <w:tcMar/>
-          </w:tcPr>
-          <w:p w14:noSpellErr="1">
-            <w:pPr>
-              <w:jc w:val="center"/>
-              <w:rPr>
-                <w:rFonts w:cs="Calibri" w:cstheme="minorAscii"/>
-                <w:b w:val="1"/>
-                <w:bCs w:val="1"/>
-                <w:sz w:val="18"/>
-                <w:szCs w:val="18"/>
-              </w:rPr>
-            </w:pPr>
-          </w:p>
-        </w:tc>
-        <w:tc>
-          <w:tcPr>
-            <w:tcW w:w="1250" w:type="dxa"/>
-            <w:tcMar/>
-          </w:tcPr>
-          <w:p w14:noSpellErr="1">
-            <w:pPr>
-              <w:jc w:val="center"/>
-              <w:rPr>
-                <w:rFonts w:cs="Calibri" w:cstheme="minorAscii"/>
-                <w:b w:val="1"/>
-                <w:bCs w:val="1"/>
-                <w:sz w:val="18"/>
-                <w:szCs w:val="18"/>
-              </w:rPr>
-            </w:pPr>
-          </w:p>
-        </w:tc>
-        <w:tc>
-          <w:tcPr>
-            <w:tcW w:w="2557" w:type="dxa"/>
-            <w:tcMar/>
-          </w:tcPr>
-          <w:p w14:noSpellErr="1">
-            <w:pPr>
-              <w:jc w:val="center"/>
-              <w:rPr>
-                <w:rFonts w:cs="Calibri" w:cstheme="minorAscii"/>
-                <w:b w:val="1"/>
-                <w:bCs w:val="1"/>
-                <w:sz w:val="18"/>
-                <w:szCs w:val="18"/>
-              </w:rPr>
-            </w:pPr>
-          </w:p>
-        </w:tc>
-      </w:tr>
-      <w:tr>
-        <w:trPr>
-          <w:trHeight w:val="591"/>
-          <w:jc w:val="center"/>
-        </w:trPr>
-        <w:tc>
-          <w:tcPr>
-            <w:tcW w:w="1931" w:type="dxa"/>
-            <w:tcMar/>
-          </w:tcPr>
-          <w:p w14:noSpellErr="1">
-            <w:pPr>
-              <w:jc w:val="center"/>
-              <w:rPr>
-                <w:rFonts w:cs="Calibri" w:cstheme="minorAscii"/>
-                <w:b w:val="1"/>
-                <w:bCs w:val="1"/>
-                <w:sz w:val="18"/>
-                <w:szCs w:val="18"/>
-              </w:rPr>
-            </w:pPr>
-          </w:p>
-        </w:tc>
-        <w:tc>
-          <w:tcPr>
-            <w:tcW w:w="1017" w:type="dxa"/>
-            <w:tcMar/>
-          </w:tcPr>
-          <w:p w14:noSpellErr="1">
-            <w:pPr>
-              <w:jc w:val="center"/>
-              <w:rPr>
-                <w:rFonts w:cs="Calibri" w:cstheme="minorAscii"/>
-                <w:b w:val="1"/>
-                <w:bCs w:val="1"/>
-                <w:sz w:val="18"/>
-                <w:szCs w:val="18"/>
-              </w:rPr>
-            </w:pPr>
-          </w:p>
-        </w:tc>
-        <w:tc>
-          <w:tcPr>
-            <w:tcW w:w="926" w:type="dxa"/>
-            <w:tcMar/>
-          </w:tcPr>
-          <w:p w14:noSpellErr="1">
-            <w:pPr>
-              <w:jc w:val="center"/>
-              <w:rPr>
-                <w:rFonts w:cs="Calibri" w:cstheme="minorAscii"/>
-                <w:b w:val="1"/>
-                <w:bCs w:val="1"/>
-                <w:sz w:val="18"/>
-                <w:szCs w:val="18"/>
-              </w:rPr>
-            </w:pPr>
-          </w:p>
-        </w:tc>
-        <w:tc>
-          <w:tcPr>
-            <w:tcW w:w="1055" w:type="dxa"/>
-            <w:tcMar/>
-          </w:tcPr>
-          <w:p w14:noSpellErr="1">
-            <w:pPr>
-              <w:jc w:val="center"/>
-              <w:rPr>
-                <w:rFonts w:cs="Calibri" w:cstheme="minorAscii"/>
-                <w:b w:val="1"/>
-                <w:bCs w:val="1"/>
-                <w:sz w:val="18"/>
-                <w:szCs w:val="18"/>
-              </w:rPr>
-            </w:pPr>
-          </w:p>
-        </w:tc>
-        <w:tc>
-          <w:tcPr>
-            <w:tcW w:w="1187" w:type="dxa"/>
-            <w:tcMar/>
-          </w:tcPr>
-          <w:p w14:noSpellErr="1">
-            <w:pPr>
-              <w:jc w:val="center"/>
-              <w:rPr>
-                <w:rFonts w:cs="Calibri" w:cstheme="minorAscii"/>
-                <w:b w:val="1"/>
-                <w:bCs w:val="1"/>
-                <w:sz w:val="18"/>
-                <w:szCs w:val="18"/>
-              </w:rPr>
-            </w:pPr>
-          </w:p>
-        </w:tc>
-        <w:tc>
-          <w:tcPr>
-            <w:tcW w:w="1250" w:type="dxa"/>
-            <w:tcMar/>
-          </w:tcPr>
-          <w:p w14:noSpellErr="1">
-            <w:pPr>
-              <w:jc w:val="center"/>
-              <w:rPr>
-                <w:rFonts w:cs="Calibri" w:cstheme="minorAscii"/>
-                <w:b w:val="1"/>
-                <w:bCs w:val="1"/>
-                <w:sz w:val="18"/>
-                <w:szCs w:val="18"/>
-              </w:rPr>
-            </w:pPr>
-          </w:p>
-        </w:tc>
-        <w:tc>
-          <w:tcPr>
-            <w:tcW w:w="2557" w:type="dxa"/>
-            <w:tcMar/>
-          </w:tcPr>
-          <w:p w14:noSpellErr="1">
-            <w:pPr>
-              <w:jc w:val="center"/>
-              <w:rPr>
-                <w:rFonts w:cs="Calibri" w:cstheme="minorAscii"/>
-                <w:b w:val="1"/>
-                <w:bCs w:val="1"/>
-                <w:sz w:val="18"/>
-                <w:szCs w:val="18"/>
-              </w:rPr>
-            </w:pPr>
-          </w:p>
-        </w:tc>
-      </w:tr>
-      <w:tr>
-        <w:trPr>
-          <w:trHeight w:val="576"/>
-          <w:jc w:val="center"/>
-        </w:trPr>
-        <w:tc>
-          <w:tcPr>
-            <w:tcW w:w="1931" w:type="dxa"/>
-            <w:tcMar/>
-          </w:tcPr>
-          <w:p w14:noSpellErr="1">
-            <w:pPr>
-              <w:jc w:val="center"/>
-              <w:rPr>
-                <w:rFonts w:cs="Calibri" w:cstheme="minorAscii"/>
-                <w:b w:val="1"/>
-                <w:bCs w:val="1"/>
-                <w:sz w:val="18"/>
-                <w:szCs w:val="18"/>
-              </w:rPr>
-            </w:pPr>
-          </w:p>
-        </w:tc>
-        <w:tc>
-          <w:tcPr>
-            <w:tcW w:w="1017" w:type="dxa"/>
-            <w:tcMar/>
-          </w:tcPr>
-          <w:p w14:noSpellErr="1">
-            <w:pPr>
-              <w:jc w:val="center"/>
-              <w:rPr>
-                <w:rFonts w:cs="Calibri" w:cstheme="minorAscii"/>
-                <w:b w:val="1"/>
-                <w:bCs w:val="1"/>
-                <w:sz w:val="18"/>
-                <w:szCs w:val="18"/>
-              </w:rPr>
-            </w:pPr>
-          </w:p>
-        </w:tc>
-        <w:tc>
-          <w:tcPr>
-            <w:tcW w:w="926" w:type="dxa"/>
-            <w:tcMar/>
-          </w:tcPr>
-          <w:p w14:noSpellErr="1">
-            <w:pPr>
-              <w:jc w:val="center"/>
-              <w:rPr>
-                <w:rFonts w:cs="Calibri" w:cstheme="minorAscii"/>
-                <w:b w:val="1"/>
-                <w:bCs w:val="1"/>
-                <w:sz w:val="18"/>
-                <w:szCs w:val="18"/>
-              </w:rPr>
-            </w:pPr>
-          </w:p>
-        </w:tc>
-        <w:tc>
-          <w:tcPr>
-            <w:tcW w:w="1055" w:type="dxa"/>
-            <w:tcMar/>
-          </w:tcPr>
-          <w:p w14:noSpellErr="1">
-            <w:pPr>
-              <w:jc w:val="center"/>
-              <w:rPr>
-                <w:rFonts w:cs="Calibri" w:cstheme="minorAscii"/>
-                <w:b w:val="1"/>
-                <w:bCs w:val="1"/>
-                <w:sz w:val="18"/>
-                <w:szCs w:val="18"/>
-              </w:rPr>
-            </w:pPr>
-          </w:p>
-        </w:tc>
-        <w:tc>
-          <w:tcPr>
-            <w:tcW w:w="1187" w:type="dxa"/>
-            <w:tcMar/>
-          </w:tcPr>
-          <w:p w14:noSpellErr="1">
-            <w:pPr>
-              <w:jc w:val="center"/>
-              <w:rPr>
-                <w:rFonts w:cs="Calibri" w:cstheme="minorAscii"/>
-                <w:b w:val="1"/>
-                <w:bCs w:val="1"/>
-                <w:sz w:val="18"/>
-                <w:szCs w:val="18"/>
-              </w:rPr>
-            </w:pPr>
-          </w:p>
-        </w:tc>
-        <w:tc>
-          <w:tcPr>
-            <w:tcW w:w="1250" w:type="dxa"/>
-            <w:tcMar/>
-          </w:tcPr>
-          <w:p w14:noSpellErr="1">
-            <w:pPr>
-              <w:jc w:val="center"/>
-              <w:rPr>
-                <w:rFonts w:cs="Calibri" w:cstheme="minorAscii"/>
-                <w:b w:val="1"/>
-                <w:bCs w:val="1"/>
-                <w:sz w:val="18"/>
-                <w:szCs w:val="18"/>
-              </w:rPr>
-            </w:pPr>
-          </w:p>
-        </w:tc>
-        <w:tc>
-          <w:tcPr>
-            <w:tcW w:w="2557" w:type="dxa"/>
-            <w:tcMar/>
-          </w:tcPr>
-          <w:p w14:noSpellErr="1">
-            <w:pPr>
-              <w:jc w:val="center"/>
-              <w:rPr>
-                <w:rFonts w:cs="Calibri" w:cstheme="minorAscii"/>
-                <w:b w:val="1"/>
-                <w:bCs w:val="1"/>
-                <w:sz w:val="18"/>
-                <w:szCs w:val="18"/>
-              </w:rPr>
-            </w:pPr>
+            <w:r/>
+            <w:r>
+              <w:t>Excelente dominio: he desarrollado aplicaciones full stack con frameworks modernos, aplicando control de versiones, contenedores y buenas prácticas de mantenimiento.</w:t>
+            </w:r>
           </w:p>
         </w:tc>
       </w:tr>

</xml_diff>